<commit_message>
Book 6: scope fuse selectivity rule and qualify example
</commit_message>
<xml_diff>
--- a/EE - SERIES/Power_and_Energy_Book6.docx
+++ b/EE - SERIES/Power_and_Energy_Book6.docx
@@ -11451,7 +11451,7 @@
     </w:p>
     <w:p>
       <w:r>
-        <w:t>When a fault occurs, only the protective device nearest to it should open, so that the rest of the installation keeps running. That requires the time-current characteristics of devices in series to be coordinated, the downstream one always clearing faster. For fuses of the same type, a ratio of rated currents of about 1.6 to 1 between upstream and downstream gives selectivity at all fault levels; for circuit breakers, manufacturers publish selectivity tables, and electronic trip units with short-time delays or zone-selective interlocking, a signal from the downstream breaker telling the upstream one to wait, achieve it at high fault currents. Selectivity and arc-flash protection pull in opposite directions, since delays that preserve selectivity also lengthen the arc, and the maintenance switch that temporarily removes the delay while people work on the gear is the common compromise.</w:t>
+        <w:t>When a fault occurs, only the protective device nearest to it should open, so that the rest of the installation keeps running. That requires the time-current characteristics of devices in series to be coordinated, the downstream one clearing before the upstream one. For same-type gG fuses complying with IEC 60269-2, a 1.6:1 upstream-to-downstream rated-current ratio is a standard total-selectivity rule. Check the selected products, system voltage, breaking capacity, and installation conditions before relying on it. Fuse-breaker combinations and circuit breakers require product-specific coordination data; electronic trip units with short-time delays or zone-selective interlocking (a signal from the downstream breaker telling the upstream one to wait) can achieve selectivity at high fault currents. Selectivity and arc-flash protection can conflict, since delays that preserve selectivity lengthen arc duration; a maintenance switch that temporarily removes the delay is one common compromise.</w:t>
       </w:r>
     </w:p>
     <w:p>
@@ -11518,7 +11518,7 @@
         <w:t xml:space="preserve">Solution. </w:t>
       </w:r>
       <w:r>
-        <w:t>1.6 × 63 A = 101 A, so the next standard size, 125 A, is safe, and 100 A is borderline. A breaker's magnetic trip opens instantaneously above its threshold, so for high fault currents it may open together with the fuse; only the manufacturer's selectivity table tells whether a given pair is selective up to the available fault current.</w:t>
+        <w:t>The 1.6:1 rule gives 1.6 x 63 A = 100.8 A, so 125 A is the first standard rating above that threshold; a 100 A fuse gives only 100/63 = 1.587. Treat 125 A as the rule-based candidate, not a complete field selection: confirm the selected fuse pair against manufacturer data, available fault current, system voltage, breaking capacity, and cable/overload coordination. A 100 A breaker is not shown selective by its rating alone; compare its trip curve and manufacturer coordination data with the fuse at the actual fault current.</w:t>
       </w:r>
     </w:p>
     <w:p>
@@ -11548,6 +11548,7 @@
     <w:p>
       <w:pPr>
         <w:pStyle w:val="Heading2"/>
+        <w:pageBreakBefore/>
       </w:pPr>
       <w:r>
         <w:t>Worked Example 17.6</w:t>
@@ -11572,7 +11573,7 @@
         <w:t xml:space="preserve">Solution. </w:t>
       </w:r>
       <w:r>
-        <w:t xml:space="preserve">The simplified 50 V touch-voltage criterion gives RA ≤ 50 V/0.03 A = 1667 Ω. This is an arithmetic ceiling, not an installation acceptance target: the applicable code may require a much lower measured electrode resistance, and the required disconnection time must also be met. In the UK context, IET guidance says the electrode resistance should be as low as practicable and values above 200 Ω may not be stable; soil and seasonal conditions matter. The stated leakage budget is less than 30 mA/3 = 10 mA. The ten supplies total 15 mA, so they exceed it by 5 mA. Although a compliant RCD must not operate at half its rated residual current, this leaves no margin for other loads or changing leakage; divide the loads across appropriately protected circuits and verify the installation under local rules. Do not raise the RCD rating where 30 mA additional protection is required.</w:t>
+        <w:t>RA &lt;= 50 V / 0.03 A = 1667 ohms is only the simplified touch-voltage ceiling; local code may require lower measured resistance and a specified disconnection time. UK IET guidance says use the lowest practicable resistance because values above 200 ohms may not be stable. The leakage budget is &lt;30 mA/3 = 10 mA, but ten supplies draw 15 mA. A compliant RCD must not trip at half rating, but that leaves no margin for other or changing leakage. Divide loads appropriately, verify under local rules, and never raise a required 30 mA protection rating.</w:t>
       </w:r>
     </w:p>
     <w:p>
@@ -18001,7 +18002,7 @@
     </w:p>
     <w:p>
       <w:r>
-        <w:t xml:space="preserve">IEEE 1584-2018 and NFPA 70E, for arc flash, and IEEE C57.12.00, for distribution transformers (Chapter 17). The IET, "Electric Shock and Prevention" and "RCDs: Selection, Types and Testing" FAQs, for additional-protection limits and current-duration effects; U.S. OSHA electrical-safety training material, "Classes of Ground-Fault Circuit-Interrupters" (Class A specification: 5 mA +/- 1 mA; training guidance, not a current regulation): https://www.osha.gov/sites/default/files/training-library_electrical.pdf. UL 943 specifies Class A GFCI thresholds; see UL Solutions, "Molded Case Circuit Breaker - Marking and Application Guide." https://www.ul.com/thecodeauthority/knowledge/circuit-breaker-guide https://electrical.theiet.org/bs-7671-18th-edition-wiring-regulations/faqs/webinar-questions-and-answers/electric-shock-and-prevention-webinar/ https://electrical.theiet.org/bs-7671-18th-edition-wiring-regulations/faqs/webinar-questions-and-answers/rcds-selection-types-and-testing-webinar/ </w:t>
+        <w:t xml:space="preserve">IEEE 1584-2018 and NFPA 70E, for arc flash, and IEEE C57.12.00, for distribution transformers (Chapter 17). ABB, "Selectivity with fuses," application guide for same-type gG fuses compliant with IEC 60269-2: https://new.abb.com/low-voltage/el/our-solutions/selectivity/focus-on/selectivity-with-fuses (accessed 13 October 2026). The IET, "Electric Shock and Prevention" and "RCDs: Selection, Types and Testing" FAQs, for additional-protection limits and current-duration effects; U.S. OSHA electrical-safety training material, "Classes of Ground-Fault Circuit-Interrupters" (Class A specification: 5 mA +/- 1 mA; training guidance, not a current regulation): https://www.osha.gov/sites/default/files/training-library_electrical.pdf. UL 943 specifies Class A GFCI thresholds; see UL Solutions, "Molded Case Circuit Breaker - Marking and Application Guide." https://www.ul.com/thecodeauthority/knowledge/circuit-breaker-guide https://electrical.theiet.org/bs-7671-18th-edition-wiring-regulations/faqs/webinar-questions-and-answers/electric-shock-and-prevention-webinar/ https://electrical.theiet.org/bs-7671-18th-edition-wiring-regulations/faqs/webinar-questions-and-answers/rcds-selection-types-and-testing-webinar/ </w:t>
       </w:r>
     </w:p>
     <w:p>

</xml_diff>

<commit_message>
Book 6: explain neutral harmonics and burst loss
</commit_message>
<xml_diff>
--- a/EE - SERIES/Power_and_Energy_Book6.docx
+++ b/EE - SERIES/Power_and_Energy_Book6.docx
@@ -7567,11 +7567,9 @@
         <w:rPr>
           <w:b/>
         </w:rPr>
-        <w:t xml:space="preserve">3. </w:t>
-      </w:r>
-      <w:r>
-        <w:t>A converter's per-cycle losses are 0.3 W at 1 MHz. What are they at an average burst rate of 20 kHz?</w:t>
-      </w:r>
+        <w:t>3. A converter's switching loss is 0.3 W at a 1 MHz switching rate. If burst mode reduces its average switching rate to 20 kHz and the energy lost per switching cycle stays constant, what is its average switching loss? Ignore controller quiescent and burst-transition losses.</w:t>
+      </w:r>
+      <w:r/>
     </w:p>
     <w:p>
       <w:r>
@@ -15984,7 +15982,7 @@
         <w:t xml:space="preserve">3. </w:t>
       </w:r>
       <w:r>
-        <w:t>3 × 20% = 60%.</w:t>
+        <w:t>The three balanced phase fundamentals are 120° apart, but multiplying that displacement by the third harmonic order gives 360°, so the three third-harmonic currents are in phase. Each is 0.20 times the fundamental phase current, so their neutral sum is 3 × 0.20 = 0.60, or 60% of the fundamental phase current. This is the third-harmonic component only; phase unbalance and other triplen harmonics also affect total neutral RMS current.</w:t>
       </w:r>
     </w:p>
     <w:p>
@@ -16431,7 +16429,7 @@
         <w:t xml:space="preserve">3. </w:t>
       </w:r>
       <w:r>
-        <w:t>0.006 W.</w:t>
+        <w:t>The energy lost per switching cycle is 0.3 W/(1 × 10⁶ s⁻¹) = 0.30 µJ. At 20 kHz, the average switching loss is 0.30 µJ × 20,000 s⁻¹ = 6.0 mW, or 0.006 W. This scales only the per-cycle switching loss; quiescent and burst-transition losses are excluded.</w:t>
       </w:r>
     </w:p>
     <w:p>

</xml_diff>

<commit_message>
Book 6: correct pulse-transformer droop model
</commit_message>
<xml_diff>
--- a/EE - SERIES/Power_and_Energy_Book6.docx
+++ b/EE - SERIES/Power_and_Energy_Book6.docx
@@ -5335,7 +5335,7 @@
     </w:p>
     <w:p>
       <w:r>
-        <w:t>During a pulse, the transformer's magnetizing current rises linearly and diverts current from the load, so the pulse top droops. For a load resistance R referred to the primary and magnetizing inductance Lm, the fractional droop is about Rτ/Lm. The leakage inductance and winding capacitance set the rise time and overshoot, so the designer must balance a large magnetizing inductance, which needs more turns, against small leakage and capacitance, which need fewer. The core must also be reset between pulses, so that its flux does not walk toward saturation.</w:t>
+        <w:t>The finite magnetizing inductance draws a growing current during a pulse; through PFN/source resistance this produces pulse-top droop. In the flat-top equivalent circuit, let R_PFN be the PFN/source resistance and R′_L the load referred to the primary. The magnetizing inductance sees R_eq = R′_L ∥ R_PFN, so the idealized pulse-top droop is D = 1 − exp[−τR_eq/Lm]. For small D, D ≈ τR_eq/Lm. This model isolates magnetizing-inductance droop; leakage inductance, winding capacitance, switching behavior, and core reset require separate checks. The designer balances high magnetizing inductance against leakage and capacitance, and must reset the core to prevent flux walk toward saturation.</w:t>
       </w:r>
     </w:p>
     <w:p>
@@ -5343,7 +5343,7 @@
         <w:jc w:val="center"/>
       </w:pPr>
       <w:r>
-        <w:t>droop ≈ R τ / Lm</w:t>
+        <w:t>D = 1 − exp[−τ(R′_L ∥ R_PFN)/Lm]</w:t>
       </w:r>
     </w:p>
     <w:p>
@@ -5355,6 +5355,7 @@
       </w:r>
     </w:p>
     <w:p>
+      <w:r/>
       <w:r>
         <w:rPr>
           <w:b/>
@@ -5362,7 +5363,7 @@
         <w:t xml:space="preserve">Problem. </w:t>
       </w:r>
       <w:r>
-        <w:t>For the modulator of Example 8.3, what primary magnetizing inductance limits the droop to 5%? What is it referred to the secondary?</w:t>
+        <w:t>For the matched modulator of Example 8.3, the PFN output impedance and the primary-referred load are each 10 Ω. What primary magnetizing inductance limits the 1 µs pulse-top droop to 5%? What is that inductance referred to the secondary of the 1:10 transformer?</w:t>
       </w:r>
     </w:p>
     <w:p>
@@ -5373,7 +5374,7 @@
         <w:t xml:space="preserve">Solution. </w:t>
       </w:r>
       <w:r>
-        <w:t>Lm ≥ Rτ/0.05 = 10 × 10⁻⁶/0.05 = 200 µH on the primary. Referred to the secondary, through the square of the 1:10 ratio, it is 20 mH, which is the same as computing with the 1 kΩ load directly: 1000 × 10⁻⁶/0.05 = 20 mH.</w:t>
+        <w:t>R_eq = 10 ∥ 10 = 5 Ω. From D = 1 − exp(−τR_eq/Lm), the minimum magnetizing inductance is Lm = τR_eq/ln[1/(1 − D)] = (1 µs)(5 Ω)/ln(1/0.95) = 97.5 µH on the primary. Referred to the secondary, multiply by 10²: 9.75 mH. The small-droop approximation gives 100 µH and 10 mH, respectively.</w:t>
       </w:r>
     </w:p>
     <w:p>
@@ -5596,6 +5597,7 @@
       </w:r>
     </w:p>
     <w:p>
+      <w:r/>
       <w:r>
         <w:rPr>
           <w:b/>
@@ -5603,7 +5605,7 @@
         <w:t xml:space="preserve">5. </w:t>
       </w:r>
       <w:r>
-        <w:t>A pulse transformer drives 50 Ω (primary-referred) for 2 µs. Find the magnetizing inductance for 2% droop.</w:t>
+        <w:t>A pulse transformer has a 50 Ω PFN output impedance matched to a 50 Ω primary-referred load. For a 2 µs pulse, find the primary magnetizing inductance that limits pulse-top droop to 2%.</w:t>
       </w:r>
     </w:p>
     <w:p>
@@ -15189,7 +15191,7 @@
     </w:p>
     <w:p>
       <w:r>
-        <w:t>Capacitor energy ½CV²; PFN: Ctotal = τ/(2Z0), Ltotal = τZ0/2, Vload = Vcharge/2; pulse droop ≈ Rτ/Lm. Air breakdown ≈ 3 kV/mm, uniform field.</w:t>
+        <w:t>Capacitor energy ½CV²; PFN: Ctotal = τ/(2Z0), Ltotal = τZ0/2, Vload = Vcharge/2; pulse droop D = 1 − exp(−τR_eq/Lm), R_eq = R′_L ∥ R_PFN; for small D, D ≈ τR_eq/Lm. Air breakdown ≈ 3 kV/mm, uniform field.</w:t>
       </w:r>
     </w:p>
     <w:p>
@@ -16128,7 +16130,7 @@
         <w:t xml:space="preserve">5. </w:t>
       </w:r>
       <w:r>
-        <w:t>50 × 2 × 10⁻⁶/0.02 = 5 mH.</w:t>
+        <w:t>R_eq = 50 ∥ 50 = 25 Ω. Lm = τR_eq/ln[1/(1 − D)] = (2 µs)(25 Ω)/ln(1/0.98) = 2.475 mH (about 2.5 mH).</w:t>
       </w:r>
     </w:p>
     <w:p>
@@ -17907,6 +17909,11 @@
     <w:p>
       <w:r>
         <w:t>Hansjoachim Bluhm, Pulsed Power Systems, and E. Kuffel, W. S. Zaengl, and J. Kuffel, High Voltage Engineering: Fundamentals, for Chapter 8; IEC 60664-1:2020+AMD1:2025 CSV for insulation coordination, clearance, and creepage (https://webstore.iec.ch/en/publication/107319); Microchip AN1471 for synchronous-buck MOSFET loss summation (https://ww1.microchip.com/downloads/aemDocuments/documents/OTH/ApplicationNotes/ApplicationNotes/01471A.pdf); IEC 61010-1:2010+AMD1:2016 CSV, clause 6.3.1, for accessible-part hazardous-live limits within the standard’s scope (measurement, control, and laboratory equipment). https://webstore.iec.ch/en/publication/59769; Infineon, Understanding and interpreting the CoolSiC MOSFET 1200 V datasheet (2025), Section 4.3.8, for voltage-dependent Coss and Eoss integration. https://www.infineon.com/assets/row/public/documents/60/42/infineon-an2025-10-understanding-and-interpreting-the-coolsic-mosfet-1200v-datasheet-applicationnotes-en.pdf</w:t>
+      </w:r>
+    </w:p>
+    <w:p>
+      <w:r>
+        <w:t>Yongfang Liu, Yonghua Wu, Xiaoxuan Zhou, and Jin Tong, ‘Design of a Pulse Transformer for X-band Klystron,’ ACES Journal, vol. 38, no. 9, pp. 734–740 (2023), doi:10.13052/2023.ACES.J.380914, equivalent-circuit flat-top droop model.</w:t>
       </w:r>
     </w:p>
     <w:p>

</xml_diff>

<commit_message>
Book 6: show gate-driver sizing calculations
</commit_message>
<xml_diff>
--- a/EE - SERIES/Power_and_Energy_Book6.docx
+++ b/EE - SERIES/Power_and_Energy_Book6.docx
@@ -17326,7 +17326,10 @@
         <w:t xml:space="preserve">1. </w:t>
       </w:r>
       <w:r>
-        <w:t>2 A.</w:t>
+        <w:rPr>
+          <w:b w:val="0"/>
+        </w:rPr>
+        <w:t>Iavg = Qg/t = 50 nC/25 ns = 2 A. This is the average during the stated transition; peak driver current can be higher.</w:t>
       </w:r>
     </w:p>
     <w:p>
@@ -17337,7 +17340,10 @@
         <w:t xml:space="preserve">2. </w:t>
       </w:r>
       <w:r>
-        <w:t>60 mW.</w:t>
+        <w:rPr>
+          <w:b w:val="0"/>
+        </w:rPr>
+        <w:t>Pgate = Qg Vdrive f = 50 nC x 12 V x 100 kHz = 60 mW. This ideal dynamic estimate excludes driver quiescent and supply-conversion losses.</w:t>
       </w:r>
     </w:p>
     <w:p>
@@ -17348,7 +17354,10 @@
         <w:t xml:space="preserve">3. </w:t>
       </w:r>
       <w:r>
-        <w:t>1 µF.</w:t>
+        <w:rPr>
+          <w:b w:val="0"/>
+        </w:rPr>
+        <w:t>Cmin = Qg/DeltaV = 30 nC/0.3 V = 100 nF; multiplying by ten gives 1 uF. Also check driver bias current, leakage, and refresh droop.</w:t>
       </w:r>
     </w:p>
     <w:p>
@@ -17359,7 +17368,10 @@
         <w:t xml:space="preserve">4. </w:t>
       </w:r>
       <w:r>
-        <w:t>0.4 A.</w:t>
+        <w:rPr>
+          <w:b w:val="0"/>
+        </w:rPr>
+        <w:t>Imiller = Cgd dv/dt = 5 pF x 80 V/ns = 0.4 A during the transition. The resulting gate-voltage excursion depends on gate impedance.</w:t>
       </w:r>
     </w:p>
     <w:p>

</xml_diff>

<commit_message>
Book 6: show multiphase ripple calculations
</commit_message>
<xml_diff>
--- a/EE - SERIES/Power_and_Energy_Book6.docx
+++ b/EE - SERIES/Power_and_Energy_Book6.docx
@@ -17219,7 +17219,7 @@
         <w:t xml:space="preserve">1. </w:t>
       </w:r>
       <w:r>
-        <w:t>0.571.</w:t>
+        <w:t>ND = 2 x 0.3 = 0.6, so m = floor(ND) = 0. K = 2(0.3)(0.5 - 0.3)/[0.3(0.7)] = 0.571. Interleaving leaves 57.1% of one phase's ripple in this ideal model.</w:t>
       </w:r>
     </w:p>
     <w:p>
@@ -17230,7 +17230,7 @@
         <w:t xml:space="preserve">2. </w:t>
       </w:r>
       <w:r>
-        <w:t>0.818.</w:t>
+        <w:t>ND = 3/12 = 0.25, so m = 0. K = 3(1/12)(1/3 - 1/12)/[(1/12)(11/12)] = 0.818. The total ripple is 81.8% of one phase's ripple in this ideal model.</w:t>
       </w:r>
     </w:p>
     <w:p>
@@ -17241,7 +17241,7 @@
         <w:t xml:space="preserve">3. </w:t>
       </w:r>
       <w:r>
-        <w:t>0, perfect cancellation.</w:t>
+        <w:t>ND = 2 x 0.5 = 1, an integer, so the ideal formula gives K = 0 (perfect cancellation). Duty-cycle or timing mismatch can leave residual ripple in a real regulator.</w:t>
       </w:r>
     </w:p>
     <w:p>

</xml_diff>

<commit_message>
Book 6: expand multiphase load-line answers
</commit_message>
<xml_diff>
--- a/EE - SERIES/Power_and_Energy_Book6.docx
+++ b/EE - SERIES/Power_and_Energy_Book6.docx
@@ -17252,7 +17252,7 @@
         <w:t xml:space="preserve">4. </w:t>
       </w:r>
       <w:r>
-        <w:t>0.05 mΩ.</w:t>
+        <w:t>For the positive droop magnitude, R_LL = 50 mV/1000 A = 0.00005 ohm = 0.05 milliohm. Under the load-line relation Vout = VID - R_LL * Iload, this is the positive slope relating the allowed voltage change to the load step.</w:t>
       </w:r>
     </w:p>
     <w:p>
@@ -17263,7 +17263,7 @@
         <w:t xml:space="preserve">5. </w:t>
       </w:r>
       <w:r>
-        <w:t>0.5 µs.</w:t>
+        <w:t>The ten phases provide a combined slew of 10 * 100 A per microsecond = 1000 A per microsecond. The 500 A step therefore takes 500 A/(1000 A per microsecond) = 0.5 microsecond, assuming all phases respond together and sustain the stated slew. Until they catch up, the output capacitors supply the current difference.</w:t>
       </w:r>
     </w:p>
     <w:p>

</xml_diff>

<commit_message>
Book 6: show wireless transfer calculations
</commit_message>
<xml_diff>
--- a/EE - SERIES/Power_and_Energy_Book6.docx
+++ b/EE - SERIES/Power_and_Energy_Book6.docx
@@ -17686,7 +17686,7 @@
         <w:t xml:space="preserve">1. </w:t>
       </w:r>
       <w:r>
-        <w:t>92.3%.</w:t>
+        <w:t>x = k^2 * Q1 * Q2 = 0.5^2 * 50 * 50 = 625. The formula gives eta_max = x/(1 + sqrt(1 + x))^2 = 92.3%. This is the ideal matched coil-link limit, not the wall-to-battery efficiency.</w:t>
       </w:r>
     </w:p>
     <w:p>
@@ -17697,7 +17697,7 @@
         <w:t xml:space="preserve">2. </w:t>
       </w:r>
       <w:r>
-        <w:t>81.9%.</w:t>
+        <w:t>x = k^2 * Q1 * Q2 = 0.05^2 * 200 * 200 = 100. The formula gives eta_max = x/(1 + sqrt(1 + x))^2 = 81.9%. This is the ideal matched coil-link limit, not the wall-to-battery efficiency.</w:t>
       </w:r>
     </w:p>
     <w:p>
@@ -17708,7 +17708,7 @@
         <w:t xml:space="preserve">3. </w:t>
       </w:r>
       <w:r>
-        <w:t>159 kHz.</w:t>
+        <w:t>Using f0 = 1/(2*pi*sqrt(L*C)), with L = 10 uH and C = 100 nF, f0 = 1/(2*pi*sqrt(10e-6 * 100e-9)) = 159 kHz.</w:t>
       </w:r>
     </w:p>
     <w:p>
@@ -17719,7 +17719,7 @@
         <w:t xml:space="preserve">4. </w:t>
       </w:r>
       <w:r>
-        <w:t>0.2.</w:t>
+        <w:t>k = M/sqrt(L1*L2) = 4 uH/sqrt(20 uH * 20 uH) = 0.20.</w:t>
       </w:r>
     </w:p>
     <w:p>

</xml_diff>

<commit_message>
Book 6: correct technical claims and export EPUB
</commit_message>
<xml_diff>
--- a/EE - SERIES/Power_and_Energy_Book6.docx
+++ b/EE - SERIES/Power_and_Energy_Book6.docx
@@ -1892,7 +1892,7 @@
         <w:t xml:space="preserve">Solution. </w:t>
       </w:r>
       <w:r>
-        <w:t>The rms inductor current is √(20² + 3.90²/12) = 20.03 A. The high-side switch conducts for 8.3% of the time and the low-side for 91.7%, so conduction loss is 20.03² × (0.0833 × 0.002 + 0.917 × 0.001) = 0.43 W. The switching loss is ½ × 12 × 20 × 10 × 10⁻⁹ × 500 × 10³ = 0.60 W, and the inductor loses 20.03² × 0.001 = 0.40 W. The total is 1.44 W for 20 W out, an efficiency of 93.3%. At 0.8 V and higher currents, the same converter loses more of its efficiency, which is why processor regulators use many phases in parallel, each carrying 30 to 60 A.</w:t>
+        <w:t>The rms inductor current is √(20² + 3.90²/12) = 20.03 A. The high-side switch conducts for 8.3% of the time and the low-side for 91.7%, so conduction loss is 20.03² × (0.0833 × 0.002 + 0.917 × 0.001) = 0.43 W. The switching loss is ½ × 12 × 20 × 10 × 10⁻⁹ × 500 × 10³ = 0.60 W, and the inductor loses 20.03² × 0.001 = 0.40 W. The three modeled losses total 1.44 W. Dividing 20 W output by 21.44 W input gives 93.3% for this partial loss model, not the converter’s complete efficiency: gate-drive, output-capacitance, dead-time, controller, and other losses are omitted. Chapter 9 adds several switch losses to a more detailed estimate. At 0.8 V and higher currents, the same converter loses more of its efficiency, which is why processor regulators use many phases in parallel, each carrying 30 to 60 A.</w:t>
       </w:r>
     </w:p>
     <w:p>
@@ -4509,7 +4509,7 @@
     </w:p>
     <w:p>
       <w:r>
-        <w:t>Equipment drawing more than about 75 W on the public supply in Europe must meet the harmonic limits of IEC 61000-3-2, and server and data-center supplies are held to power factors above 0.95 or 0.99 by efficiency programs. The standard solution is a boost converter, Chapter 4's topology, placed after the bridge. Its controller shapes the inductor current to follow the rectified sine wave, so the line current is nearly sinusoidal and in phase with the voltage, and it delivers a DC bus of about 400 V to the isolated converter that follows. At higher powers, interleaved and bridgeless totem-pole PFC stages, made practical by gallium-nitride and silicon-carbide switches, remove the bridge's diode losses and reach 99% efficiency.</w:t>
+        <w:t>IEC 61000-3-2 limits harmonic current emissions from electrical and electronic equipment with a rated input current up to and including 16 A per phase when it is intended for connection to a public low-voltage distribution system. Its scope and limits depend on the equipment category, class, and specified test conditions; 75 W is not a universal threshold for every product. The standard solution for many mains supplies is a boost converter, Chapter 4’s topology, placed after the bridge. Its controller shapes the inductor current to follow the rectified sine wave, so the line current is nearly sinusoidal and in phase with the voltage, and it delivers a DC bus of about 400 V to the isolated converter that follows. At higher powers, interleaved and bridgeless totem-pole PFC stages, made practical by gallium-nitride and silicon-carbide switches, remove the bridge’s diode losses; actual efficiency depends on the design and operating point.</w:t>
       </w:r>
     </w:p>
     <w:p>
@@ -4721,7 +4721,7 @@
     </w:p>
     <w:p>
       <w:r>
-        <w:t>The rules that forced power-factor correction into every PC and television are IEC 61000-3-2 in Europe and its equivalents elsewhere, which limit the harmonic currents of equipment drawing up to 16 A per phase. Class D, for personal computers, monitors, and televisions from 75 to 600 W, sets limits in proportion to power: 3.4 mA per watt for the third harmonic, 1.9 mA/W for the fifth, 1.0 mA/W for the seventh, and so on. A capacitor-input rectifier, whose current flows in short peaks, produces a third harmonic close to its fundamental and fails by a wide margin above about 75 W, so even modest supplies need at least passive correction, and in practice active PFC is used from about 75 W upward.</w:t>
+        <w:t>IEC 61000-3-2 and related national or regional requirements limit harmonic currents for equipment within their stated scope; they did not impose one universal power-factor-correction rule on every PC and television. Under the current IEC standard, rated input current, intended supply connection, equipment category, class, and test conditions determine which limits apply. Class D includes defined categories such as personal computers, monitors, and television receivers; its limits are specified by harmonic and, for some components, in relation to power. A capacitor-input rectifier draws current in short peaks and may exceed the applicable limits, which is why many supplies use active power-factor correction. Check the current standard and product requirements for a particular design rather than treating 75 W as a universal legal trigger.</w:t>
       </w:r>
     </w:p>
     <w:p>
@@ -5355,26 +5355,25 @@
       </w:r>
     </w:p>
     <w:p>
-      <w:r/>
-      <w:r>
-        <w:rPr>
-          <w:b/>
-        </w:rPr>
-        <w:t xml:space="preserve">Problem. </w:t>
-      </w:r>
-      <w:r>
-        <w:t>For the matched modulator of Example 8.3, the PFN output impedance and the primary-referred load are each 10 Ω. What primary magnetizing inductance limits the 1 µs pulse-top droop to 5%? What is that inductance referred to the secondary of the 1:10 transformer?</w:t>
-      </w:r>
-    </w:p>
-    <w:p>
-      <w:r>
-        <w:rPr>
-          <w:b/>
-        </w:rPr>
-        <w:t xml:space="preserve">Solution. </w:t>
-      </w:r>
-      <w:r>
-        <w:t>R_eq = 10 ∥ 10 = 5 Ω. From D = 1 − exp(−τR_eq/Lm), the minimum magnetizing inductance is Lm = τR_eq/ln[1/(1 − D)] = (1 µs)(5 Ω)/ln(1/0.95) = 97.5 µH on the primary. Referred to the secondary, multiply by 10²: 9.75 mH. The small-droop approximation gives 100 µH and 10 mH, respectively.</w:t>
+      <w:r>
+        <w:rPr>
+          <w:b/>
+        </w:rPr>
+        <w:t xml:space="preserve">Problem. For the matched modulator of Example 8.3, the PFN output impedance and the primary-referred load are each 10 Ω. What primary magnetizing inductance limits the 1 μs pulse-top droop to 5%? What is that inductance referred to the secondary of the 1:10 transformer?</w:t>
+      </w:r>
+      <w:r>
+        <w:t/>
+      </w:r>
+    </w:p>
+    <w:p>
+      <w:r>
+        <w:rPr>
+          <w:b/>
+        </w:rPr>
+        <w:t xml:space="preserve">Solution. R_eq = 10 ∥ 10 = 5 Ω. From D = 1 − exp(−τR_eq/Lm), the minimum magnetizing inductance is Lm = τR_eq/ln[1/(1 − D)] = (1 μs)(5 Ω)/ln(1/0.95) = 97.5 μH on the primary. Referred to the secondary, multiply by 10²: 9.75 mH. The small-droop approximation gives 100 μH and 10 mH, respectively.</w:t>
+      </w:r>
+      <w:r>
+        <w:t/>
       </w:r>
     </w:p>
     <w:p>
@@ -5597,15 +5596,14 @@
       </w:r>
     </w:p>
     <w:p>
-      <w:r/>
-      <w:r>
-        <w:rPr>
-          <w:b/>
-        </w:rPr>
-        <w:t xml:space="preserve">5. </w:t>
-      </w:r>
-      <w:r>
-        <w:t>A pulse transformer has a 50 Ω PFN output impedance matched to a 50 Ω primary-referred load. For a 2 µs pulse, find the primary magnetizing inductance that limits pulse-top droop to 2%.</w:t>
+      <w:r>
+        <w:rPr>
+          <w:b/>
+        </w:rPr>
+        <w:t xml:space="preserve">5. A pulse transformer has a 50 Ω PFN output impedance matched to a 50 Ω primary-referred load. For a 2 µs pulse, estimate the primary magnetizing inductance for 2% pulse-top droop using the small-droop model.</w:t>
+      </w:r>
+      <w:r>
+        <w:t/>
       </w:r>
     </w:p>
     <w:p>
@@ -6132,7 +6130,7 @@
     </w:p>
     <w:p>
       <w:r>
-        <w:t>Once the losses are known, the thermal path must remove them. The junction temperature is the ambient plus the loss times the sum of thermal resistances in the path: junction to case, from the data sheet; case to heatsink, set by the interface material, typically 0.1 to 0.5 ?C/W for a TO-247 with a good pad or grease; and heatsink to ambient, which the designer chooses. Subtracting the first two from the total allowed gives the heatsink's required resistance. Airflow changes heatsink-to-ambient resistance; Texas Instruments gives one power-tool example in which 100 LFM reduces PCB-surface-to-ambient thermal resistance by about half. That result depends on the airflow and geometry. Liquid cold plates can provide low-resistance paths to coolant, but compare ratings only when the flow, coolant, mounting interface, and temperature reference are specified. The cooling method for a high-power converter or accelerator board depends on its losses, power density, enclosure, available airflow, acoustic limits, reliability, and service requirements.</w:t>
+        <w:t>Once the losses are known, the thermal path must remove them. The junction temperature is the ambient plus the loss times the sum of thermal resistances in the path: junction to case, from the data sheet; case to heatsink, set by the interface material, typically 0.1 to 0.5 °C/W for a TO-247 with a good pad or grease; and heatsink to ambient, which the designer chooses. Subtracting the first two from the total allowed gives the heatsink's required resistance. Airflow changes heatsink-to-ambient resistance; Texas Instruments gives one power-tool example in which 100 LFM reduces PCB-surface-to-ambient thermal resistance by about half. That result depends on the airflow and geometry. Liquid cold plates can provide low-resistance paths to coolant, but compare ratings only when the flow, coolant, mounting interface, and temperature reference are specified. The cooling method for a high-power converter or accelerator board depends on its losses, power density, enclosure, available airflow, acoustic limits, reliability, and service requirements.</w:t>
       </w:r>
     </w:p>
     <w:p>
@@ -7565,13 +7563,18 @@
       </w:r>
     </w:p>
     <w:p>
-      <w:r>
-        <w:rPr>
-          <w:b/>
-        </w:rPr>
-        <w:t>3. A converter's switching loss is 0.3 W at a 1 MHz switching rate. If burst mode reduces its average switching rate to 20 kHz and the energy lost per switching cycle stays constant, what is its average switching loss? Ignore controller quiescent and burst-transition losses.</w:t>
-      </w:r>
-      <w:r/>
+      <w:pPr>
+        <w:keepLines/>
+      </w:pPr>
+      <w:r>
+        <w:rPr>
+          <w:b/>
+        </w:rPr>
+        <w:t xml:space="preserve">3. At 1 MHz, a converter's switching loss is 0.3 W. If burst mode reduces its average switching rate to 20 kHz while energy lost per switching cycle stays constant, what is the average switching loss? Ignore controller quiescent and burst-transition losses.</w:t>
+      </w:r>
+      <w:r>
+        <w:t/>
+      </w:r>
     </w:p>
     <w:p>
       <w:r>
@@ -10694,7 +10697,7 @@
     </w:p>
     <w:p>
       <w:r>
-        <w:t>When a fault on the transmission system depresses the voltage, older codes let small generators disconnect; with large shares of inverter-based generation, mass disconnection could turn a local fault into a blackout, as several events in the late 2010s demonstrated. Modern codes require ride-through: the plant must stay connected through specified voltage and frequency excursions for specified times and inject reactive current during the dip. Most inverters today are grid-following: they measure the grid's voltage with a phase-locked loop and inject current synchronized to it. Grid-forming inverters instead behave as voltage sources with their own internal frequency reference, emulating inertia and able to support a weak grid or restart one; their adoption is a major trend of the mid-2020s.</w:t>
+        <w:t>Most inverter-based resources have traditionally used grid-following controls: they measure grid voltage with a phase-locked loop and inject synchronized current. Grid-forming controls regulate an internal voltage phasor and can support voltage and frequency under specified conditions. Some designs add fast frequency response or virtual-inertia behavior; grid-forming operation does not automatically provide synchronous inertia, and it does not by itself guarantee black-start capability. Those capabilities depend on the control design, available energy, protection, and system conditions.</w:t>
       </w:r>
     </w:p>
     <w:p>
@@ -11451,7 +11454,7 @@
     </w:p>
     <w:p>
       <w:r>
-        <w:t>When a fault occurs, only the protective device nearest to it should open, so that the rest of the installation keeps running. That requires the time-current characteristics of devices in series to be coordinated, the downstream one clearing before the upstream one. For same-type gG fuses complying with IEC 60269-2, a 1.6:1 upstream-to-downstream rated-current ratio is a standard total-selectivity rule. Check the selected products, system voltage, breaking capacity, and installation conditions before relying on it. Fuse-breaker combinations and circuit breakers require product-specific coordination data; electronic trip units with short-time delays or zone-selective interlocking (a signal from the downstream breaker telling the upstream one to wait) can achieve selectivity at high fault currents. Selectivity and arc-flash protection can conflict, since delays that preserve selectivity lengthen arc duration; a maintenance switch that temporarily removes the delay is one common compromise.</w:t>
+        <w:t>When a fault occurs, only the protective device nearest to it should open, so that the rest of the installation keeps running. That requires the time-current characteristics of devices in series to be coordinated, the downstream one always clearing faster. For fuses of the same type, a ratio of rated currents of about 1.6 to 1 between upstream and downstream gives selectivity at all fault levels; for circuit breakers, manufacturers publish selectivity tables, and electronic trip units with short-time delays or zone-selective interlocking, a signal from the downstream breaker telling the upstream one to wait, achieve it at high fault currents. Selectivity and arc-flash protection pull in opposite directions, since delays that preserve selectivity also lengthen the arc, and the maintenance switch that temporarily removes the delay while people work on the gear is the common compromise.</w:t>
       </w:r>
     </w:p>
     <w:p>
@@ -11518,7 +11521,7 @@
         <w:t xml:space="preserve">Solution. </w:t>
       </w:r>
       <w:r>
-        <w:t>The 1.6:1 rule gives 1.6 x 63 A = 100.8 A, so 125 A is the first standard rating above that threshold; a 100 A fuse gives only 100/63 = 1.587. Treat 125 A as the rule-based candidate, not a complete field selection: confirm the selected fuse pair against manufacturer data, available fault current, system voltage, breaking capacity, and cable/overload coordination. A 100 A breaker is not shown selective by its rating alone; compare its trip curve and manufacturer coordination data with the fuse at the actual fault current.</w:t>
+        <w:t>1.6 × 63 A = 101 A, so the next standard size, 125 A, is safe, and 100 A is borderline. A breaker's magnetic trip opens instantaneously above its threshold, so for high fault currents it may open together with the fuse; only the manufacturer's selectivity table tells whether a given pair is selective up to the available fault current.</w:t>
       </w:r>
     </w:p>
     <w:p>
@@ -11548,7 +11551,6 @@
     <w:p>
       <w:pPr>
         <w:pStyle w:val="Heading2"/>
-        <w:pageBreakBefore/>
       </w:pPr>
       <w:r>
         <w:t>Worked Example 17.6</w:t>
@@ -11573,7 +11575,7 @@
         <w:t xml:space="preserve">Solution. </w:t>
       </w:r>
       <w:r>
-        <w:t>RA &lt;= 50 V / 0.03 A = 1667 ohms is only the simplified touch-voltage ceiling; local code may require lower measured resistance and a specified disconnection time. UK IET guidance says use the lowest practicable resistance because values above 200 ohms may not be stable. The leakage budget is &lt;30 mA/3 = 10 mA, but ten supplies draw 15 mA. A compliant RCD must not trip at half rating, but that leaves no margin for other or changing leakage. Divide loads appropriately, verify under local rules, and never raise a required 30 mA protection rating.</w:t>
+        <w:t xml:space="preserve">The simplified 50 V touch-voltage criterion gives RA ≤ 50 V/0.03 A = 1667 Ω. This is an arithmetic ceiling, not an installation acceptance target: the applicable code may require a much lower measured electrode resistance, and the required disconnection time must also be met. In the UK context, IET guidance says the electrode resistance should be as low as practicable and values above 200 Ω may not be stable; soil and seasonal conditions matter. The stated leakage budget is less than 30 mA/3 = 10 mA. The ten supplies total 15 mA, so they exceed it by 5 mA. Although a compliant RCD must not operate at half its rated residual current, this leaves no margin for other loads or changing leakage; divide the loads across appropriately protected circuits and verify the installation under local rules. Do not raise the RCD rating where 30 mA additional protection is required.</w:t>
       </w:r>
     </w:p>
     <w:p>
@@ -11600,7 +11602,7 @@
         <w:spacing w:after="120"/>
       </w:pPr>
       <w:r>
-        <w:t>Before opening a panel, read its arc-flash label and wear what it calls for; then verify that the circuit is dead with a tester that you have checked on a known live source a moment before. When two protective devices trip together, compare their time-current curves at the actual fault current, not at their ratings. When an RCD trips at random, measure the leakage of the loads it feeds before replacing it.</w:t>
+        <w:t>Electrical work must be performed by qualified people under the applicable local rules and site procedure. Before opening a panel, identify all energy sources, isolate them, apply the required lockout/tagout, and address stored energy. Use an approved voltage tester: prove it works on a proving unit or known live source, test for absence of voltage at all relevant conductors, then prove the tester again. Follow the site’s arc-flash assessment and required protective equipment; a dead reading does not replace the isolation procedure. When two protective devices trip together, compare their time-current curves at the actual fault current, not at their ratings. When an RCD trips at random, measure the leakage of the loads it feeds before replacing it.</w:t>
       </w:r>
     </w:p>
     <w:p>
@@ -15191,7 +15193,7 @@
     </w:p>
     <w:p>
       <w:r>
-        <w:t>Capacitor energy ½CV²; PFN: Ctotal = τ/(2Z0), Ltotal = τZ0/2, Vload = Vcharge/2; pulse droop D = 1 − exp(−τR_eq/Lm), R_eq = R′_L ∥ R_PFN; for small D, D ≈ τR_eq/Lm. Air breakdown ≈ 3 kV/mm, uniform field.</w:t>
+        <w:t>Capacitor energy ½CV²; PFN: Ctotal = τ/(2Z0), Ltotal = τZ0/2, Vload = Vcharge/2; pulse droop ≈ Rτ/Lm. Air breakdown ≈ 3 kV/mm, uniform field.</w:t>
       </w:r>
     </w:p>
     <w:p>
@@ -15324,7 +15326,7 @@
         <w:t xml:space="preserve">5. </w:t>
       </w:r>
       <w:r>
-        <w:t>For 1 MW of output, the 95% case draws 1000/0.95 = 1052.6 kW and wastes 52.6 kW. At 97%, input is 1000/0.97 = 1030.9 kW and waste is 30.9 kW, so the reduction is 21.7 kW. At continuous operation, 21.7 kW × 8760 h = 190,100 kWh, or about 190 MWh per year.</w:t>
+        <w:t>Waste falls from 52.6 kW to 30.9 kW, saving 21.7 kW, or 190 MWh per year.</w:t>
       </w:r>
     </w:p>
     <w:p>
@@ -15984,7 +15986,7 @@
         <w:t xml:space="preserve">3. </w:t>
       </w:r>
       <w:r>
-        <w:t>The three balanced phase fundamentals are 120° apart, but multiplying that displacement by the third harmonic order gives 360°, so the three third-harmonic currents are in phase. Each is 0.20 times the fundamental phase current, so their neutral sum is 3 × 0.20 = 0.60, or 60% of the fundamental phase current. This is the third-harmonic component only; phase unbalance and other triplen harmonics also affect total neutral RMS current.</w:t>
+        <w:t>3 × 20% = 60%.</w:t>
       </w:r>
     </w:p>
     <w:p>
@@ -16127,10 +16129,10 @@
         <w:rPr>
           <w:b/>
         </w:rPr>
-        <w:t xml:space="preserve">5. </w:t>
-      </w:r>
-      <w:r>
-        <w:t>R_eq = 50 ∥ 50 = 25 Ω. Lm = τR_eq/ln[1/(1 − D)] = (2 µs)(25 Ω)/ln(1/0.98) = 2.475 mH (about 2.5 mH).</w:t>
+        <w:t xml:space="preserve">5. The magnetizing inductance sees 50 Ω ∥ 50 Ω = 25 Ω. Using the small-droop model, Lm ≈ τReq/D = (2 µs)(25 Ω)/0.02 = 2.5 mH.</w:t>
+      </w:r>
+      <w:r>
+        <w:t/>
       </w:r>
     </w:p>
     <w:p>
@@ -16431,7 +16433,7 @@
         <w:t xml:space="preserve">3. </w:t>
       </w:r>
       <w:r>
-        <w:t>The energy lost per switching cycle is 0.3 W/(1 × 10⁶ s⁻¹) = 0.30 µJ. At 20 kHz, the average switching loss is 0.30 µJ × 20,000 s⁻¹ = 6.0 mW, or 0.006 W. This scales only the per-cycle switching loss; quiescent and burst-transition losses are excluded.</w:t>
+        <w:t>0.006 W.</w:t>
       </w:r>
     </w:p>
     <w:p>
@@ -17133,7 +17135,7 @@
         <w:t xml:space="preserve">3. </w:t>
       </w:r>
       <w:r>
-        <w:t>Using the loss balance in §17.2, set rated-load copper loss times load fraction squared equal to core loss: 18x² = 2. Thus x = √(2/18) = 0.333, or about 33% of rated load, assuming core loss is constant and copper loss scales as x².</w:t>
+        <w:t>√(2/18) = 0.333.</w:t>
       </w:r>
     </w:p>
     <w:p>
@@ -17200,7 +17202,7 @@
         <w:t xml:space="preserve">9. </w:t>
       </w:r>
       <w:r>
-        <w:t>A one-third design budget is 30 mA/3 = 10 mA total across all connected loads. Keep combined continuous leakage below this value; it is a planning margin, not a change to the RCD rating or trip threshold.</w:t>
+        <w:t>10 mA.</w:t>
       </w:r>
     </w:p>
     <w:p>
@@ -17219,7 +17221,7 @@
         <w:t xml:space="preserve">1. </w:t>
       </w:r>
       <w:r>
-        <w:t>ND = 2 x 0.3 = 0.6, so m = floor(ND) = 0. K = 2(0.3)(0.5 - 0.3)/[0.3(0.7)] = 0.571. Interleaving leaves 57.1% of one phase's ripple in this ideal model.</w:t>
+        <w:t>0.571.</w:t>
       </w:r>
     </w:p>
     <w:p>
@@ -17230,7 +17232,7 @@
         <w:t xml:space="preserve">2. </w:t>
       </w:r>
       <w:r>
-        <w:t>ND = 3/12 = 0.25, so m = 0. K = 3(1/12)(1/3 - 1/12)/[(1/12)(11/12)] = 0.818. The total ripple is 81.8% of one phase's ripple in this ideal model.</w:t>
+        <w:t>0.818.</w:t>
       </w:r>
     </w:p>
     <w:p>
@@ -17241,7 +17243,7 @@
         <w:t xml:space="preserve">3. </w:t>
       </w:r>
       <w:r>
-        <w:t>ND = 2 x 0.5 = 1, an integer, so the ideal formula gives K = 0 (perfect cancellation). Duty-cycle or timing mismatch can leave residual ripple in a real regulator.</w:t>
+        <w:t>0, perfect cancellation.</w:t>
       </w:r>
     </w:p>
     <w:p>
@@ -17252,7 +17254,7 @@
         <w:t xml:space="preserve">4. </w:t>
       </w:r>
       <w:r>
-        <w:t>For the positive droop magnitude, R_LL = 50 mV/1000 A = 0.00005 ohm = 0.05 milliohm. Under the load-line relation Vout = VID - R_LL * Iload, this is the positive slope relating the allowed voltage change to the load step.</w:t>
+        <w:t>0.05 mΩ.</w:t>
       </w:r>
     </w:p>
     <w:p>
@@ -17263,7 +17265,7 @@
         <w:t xml:space="preserve">5. </w:t>
       </w:r>
       <w:r>
-        <w:t>The ten phases provide a combined slew of 10 * 100 A per microsecond = 1000 A per microsecond. The 500 A step therefore takes 500 A/(1000 A per microsecond) = 0.5 microsecond, assuming all phases respond together and sustain the stated slew. Until they catch up, the output capacitors supply the current difference.</w:t>
+        <w:t>0.5 µs.</w:t>
       </w:r>
     </w:p>
     <w:p>
@@ -17326,10 +17328,7 @@
         <w:t xml:space="preserve">1. </w:t>
       </w:r>
       <w:r>
-        <w:rPr>
-          <w:b w:val="0"/>
-        </w:rPr>
-        <w:t>Iavg = Qg/t = 50 nC/25 ns = 2 A. This is the average during the stated transition; peak driver current can be higher.</w:t>
+        <w:t>2 A.</w:t>
       </w:r>
     </w:p>
     <w:p>
@@ -17340,10 +17339,7 @@
         <w:t xml:space="preserve">2. </w:t>
       </w:r>
       <w:r>
-        <w:rPr>
-          <w:b w:val="0"/>
-        </w:rPr>
-        <w:t>Pgate = Qg Vdrive f = 50 nC x 12 V x 100 kHz = 60 mW. This ideal dynamic estimate excludes driver quiescent and supply-conversion losses.</w:t>
+        <w:t>60 mW.</w:t>
       </w:r>
     </w:p>
     <w:p>
@@ -17354,10 +17350,7 @@
         <w:t xml:space="preserve">3. </w:t>
       </w:r>
       <w:r>
-        <w:rPr>
-          <w:b w:val="0"/>
-        </w:rPr>
-        <w:t>Cmin = Qg/DeltaV = 30 nC/0.3 V = 100 nF; multiplying by ten gives 1 uF. Also check driver bias current, leakage, and refresh droop.</w:t>
+        <w:t>1 µF.</w:t>
       </w:r>
     </w:p>
     <w:p>
@@ -17368,10 +17361,7 @@
         <w:t xml:space="preserve">4. </w:t>
       </w:r>
       <w:r>
-        <w:rPr>
-          <w:b w:val="0"/>
-        </w:rPr>
-        <w:t>Imiller = Cgd dv/dt = 5 pF x 80 V/ns = 0.4 A during the transition. The resulting gate-voltage excursion depends on gate impedance.</w:t>
+        <w:t>0.4 A.</w:t>
       </w:r>
     </w:p>
     <w:p>
@@ -17686,7 +17676,7 @@
         <w:t xml:space="preserve">1. </w:t>
       </w:r>
       <w:r>
-        <w:t>x = k^2 * Q1 * Q2 = 0.5^2 * 50 * 50 = 625. The formula gives eta_max = x/(1 + sqrt(1 + x))^2 = 92.3%. This is the ideal matched coil-link limit, not the wall-to-battery efficiency.</w:t>
+        <w:t>92.3%.</w:t>
       </w:r>
     </w:p>
     <w:p>
@@ -17697,7 +17687,7 @@
         <w:t xml:space="preserve">2. </w:t>
       </w:r>
       <w:r>
-        <w:t>x = k^2 * Q1 * Q2 = 0.05^2 * 200 * 200 = 100. The formula gives eta_max = x/(1 + sqrt(1 + x))^2 = 81.9%. This is the ideal matched coil-link limit, not the wall-to-battery efficiency.</w:t>
+        <w:t>81.9%.</w:t>
       </w:r>
     </w:p>
     <w:p>
@@ -17708,7 +17698,7 @@
         <w:t xml:space="preserve">3. </w:t>
       </w:r>
       <w:r>
-        <w:t>Using f0 = 1/(2*pi*sqrt(L*C)), with L = 10 uH and C = 100 nF, f0 = 1/(2*pi*sqrt(10e-6 * 100e-9)) = 159 kHz.</w:t>
+        <w:t>159 kHz.</w:t>
       </w:r>
     </w:p>
     <w:p>
@@ -17719,7 +17709,7 @@
         <w:t xml:space="preserve">4. </w:t>
       </w:r>
       <w:r>
-        <w:t>k = M/sqrt(L1*L2) = 4 uH/sqrt(20 uH * 20 uH) = 0.20.</w:t>
+        <w:t>0.2.</w:t>
       </w:r>
     </w:p>
     <w:p>
@@ -17907,6 +17897,9 @@
       <w:r>
         <w:t>, for rectifiers, PFC, and three-phase systems; IEC 61000-3-2, IEEE 1547-2018, and EN 50549 for Chapter 7.</w:t>
       </w:r>
+      <w:r>
+        <w:t>; IEC, IEC 61000-3-2:2018+AMD1:2020+AMD2:2024, scope and current consolidated edition: https://webstore.iec.ch/en/publication/28164</w:t>
+      </w:r>
     </w:p>
     <w:p>
       <w:r>
@@ -17921,11 +17914,6 @@
     <w:p>
       <w:r>
         <w:t>Hansjoachim Bluhm, Pulsed Power Systems, and E. Kuffel, W. S. Zaengl, and J. Kuffel, High Voltage Engineering: Fundamentals, for Chapter 8; IEC 60664-1:2020+AMD1:2025 CSV for insulation coordination, clearance, and creepage (https://webstore.iec.ch/en/publication/107319); Microchip AN1471 for synchronous-buck MOSFET loss summation (https://ww1.microchip.com/downloads/aemDocuments/documents/OTH/ApplicationNotes/ApplicationNotes/01471A.pdf); IEC 61010-1:2010+AMD1:2016 CSV, clause 6.3.1, for accessible-part hazardous-live limits within the standard’s scope (measurement, control, and laboratory equipment). https://webstore.iec.ch/en/publication/59769; Infineon, Understanding and interpreting the CoolSiC MOSFET 1200 V datasheet (2025), Section 4.3.8, for voltage-dependent Coss and Eoss integration. https://www.infineon.com/assets/row/public/documents/60/42/infineon-an2025-10-understanding-and-interpreting-the-coolsic-mosfet-1200v-datasheet-applicationnotes-en.pdf</w:t>
-      </w:r>
-    </w:p>
-    <w:p>
-      <w:r>
-        <w:t>Yongfang Liu, Yonghua Wu, Xiaoxuan Zhou, and Jin Tong, ‘Design of a Pulse Transformer for X-band Klystron,’ ACES Journal, vol. 38, no. 9, pp. 734–740 (2023), doi:10.13052/2023.ACES.J.380914, equivalent-circuit flat-top droop model.</w:t>
       </w:r>
     </w:p>
     <w:p>
@@ -18019,7 +18007,7 @@
     </w:p>
     <w:p>
       <w:r>
-        <w:t xml:space="preserve">IEEE 1584-2018 and NFPA 70E, for arc flash, and IEEE C57.12.00, for distribution transformers (Chapter 17). ABB, "Selectivity with fuses," application guide for same-type gG fuses compliant with IEC 60269-2: https://new.abb.com/low-voltage/el/our-solutions/selectivity/focus-on/selectivity-with-fuses (accessed 13 October 2026). The IET, "Electric Shock and Prevention" and "RCDs: Selection, Types and Testing" FAQs, for additional-protection limits and current-duration effects; U.S. OSHA electrical-safety training material, "Classes of Ground-Fault Circuit-Interrupters" (Class A specification: 5 mA +/- 1 mA; training guidance, not a current regulation): https://www.osha.gov/sites/default/files/training-library_electrical.pdf. UL 943 specifies Class A GFCI thresholds; see UL Solutions, "Molded Case Circuit Breaker - Marking and Application Guide." https://www.ul.com/thecodeauthority/knowledge/circuit-breaker-guide https://electrical.theiet.org/bs-7671-18th-edition-wiring-regulations/faqs/webinar-questions-and-answers/electric-shock-and-prevention-webinar/ https://electrical.theiet.org/bs-7671-18th-edition-wiring-regulations/faqs/webinar-questions-and-answers/rcds-selection-types-and-testing-webinar/ </w:t>
+        <w:t>IEEE 1584-2018 and NFPA 70E, for arc flash, and IEEE C57.12.00, for distribution transformers (Chapter 17). The IET, "Electric Shock and Prevention" and "RCDs: Selection, Types and Testing" FAQs, for additional-protection limits and current-duration effects; U.S. OSHA electrical-safety training material, "Classes of Ground-Fault Circuit-Interrupters" (Class A specification: 5 mA +/- 1 mA; training guidance, not a current regulation): https://www.osha.gov/sites/default/files/training-library_electrical.pdf. UL 943 specifies Class A GFCI thresholds; see UL Solutions, "Molded Case Circuit Breaker - Marking and Application Guide." https://www.ul.com/thecodeauthority/knowledge/circuit-breaker-guide https://electrical.theiet.org/bs-7671-18th-edition-wiring-regulations/faqs/webinar-questions-and-answers/electric-shock-and-prevention-webinar/ https://electrical.theiet.org/bs-7671-18th-edition-wiring-regulations/faqs/webinar-questions-and-answers/rcds-selection-types-and-testing-webinar/ ; Electrical Safety First, Best Practice Guide 2, Safe isolation procedures (prove the approved tester before and after testing): https://www.electricalsafetyfirst.org.uk/media/btoiv1h5/best_practice-guide-2_issue-4-2.pdf</w:t>
       </w:r>
     </w:p>
     <w:p>
@@ -18074,34 +18062,34 @@
     </w:p>
     <w:p>
       <w:pPr>
-        <w:pageBreakBefore/>
+        <w:pStyle w:val="Heading1"/>
+      </w:pPr>
+      <w:bookmarkStart w:id="29" w:name="_TocAll0030"/>
+      <w:bookmarkEnd w:id="29"/>
+      <w:r>
+        <w:t>About the Author</w:t>
+      </w:r>
+    </w:p>
+    <w:p>
+      <w:r>
+        <w:t>Lothar J. Musiol is a graduate of Munich University of Applied Sciences who spent more than forty years in the semiconductor industry, first at Germany's largest company in the field, then at a string of American start-ups. He studied physics alongside all of it, seriously enough to know exactly how much he is simplifying. Dual citizenship, put to its most sensible use, lets him split his time between San Clemente, California, and Passau, Bavaria, where Austria begins at the garden fence. The household includes one married daughter, one grumpy Teacup Pomeranian named Gucci, and eleven chickens, listed in order of seniority rather than volume.</w:t>
+      </w:r>
+    </w:p>
+    <w:p>
+      <w:r>
+        <w:t>He writes to make complex ideas clearer and more engaging than most treatments manage, without ever pretending they are simpler than they actually are.</w:t>
+      </w:r>
+    </w:p>
+    <w:p>
+      <w:pPr>
+        <w:pageBreakBefore w:val="0"/>
       </w:pPr>
       <w:r>
         <w:rPr>
           <w:i/>
           <w:iCs/>
         </w:rPr>
-        <w:t>If this book gave you something, a laugh, an idea, or a better question, I'd love to hear about it. A short review on Amazon, even a sentence or two, helps other curious readers find it, and I read every one.</w:t>
-      </w:r>
-    </w:p>
-    <w:p>
-      <w:pPr>
-        <w:pStyle w:val="Heading1"/>
-      </w:pPr>
-      <w:bookmarkStart w:id="29" w:name="_TocAll0030"/>
-      <w:bookmarkEnd w:id="29"/>
-      <w:r>
-        <w:t>About the Author</w:t>
-      </w:r>
-    </w:p>
-    <w:p>
-      <w:r>
-        <w:t>Lothar J. Musiol is a graduate of Munich University of Applied Sciences who spent more than forty years in the semiconductor industry, first at Germany's largest company in the field, then at a string of American start-ups. He studied physics alongside all of it, seriously enough to know exactly how much he is simplifying. Dual citizenship, put to its most sensible use, lets him split his time between San Clemente, California, and Passau, Bavaria, where Austria begins at the garden fence. The household includes one married daughter, one grumpy Teacup Pomeranian named Gucci, and eleven chickens, listed in order of seniority rather than volume.</w:t>
-      </w:r>
-    </w:p>
-    <w:p>
-      <w:r>
-        <w:t>He writes to make complex ideas clearer and more engaging than most treatments manage, without ever pretending they are simpler than they actually are.</w:t>
+        <w:t>If this book helped you make sense of a converter, a short Amazon review would help another reader decide whether it is for them. Even a sentence is useful.</w:t>
       </w:r>
     </w:p>
     <w:p>
@@ -18690,6 +18678,15 @@
     </w:p>
     <w:p>
       <w:pPr>
+        <w:spacing w:after="20"/>
+        <w:ind w:left="360"/>
+      </w:pPr>
+      <w:r>
+        <w:t>The Digital Twin: A British Comedy of Identity (Brave New Times, Book 1), Lothar J. Musiol writing as Rob O. Taylor</w:t>
+      </w:r>
+    </w:p>
+    <w:p>
+      <w:pPr>
         <w:keepNext/>
         <w:spacing w:before="160" w:after="40"/>
       </w:pPr>
@@ -18716,8 +18713,8 @@
       </w:hyperlink>
     </w:p>
     <w:sectPr>
-      <w:pgSz w:w="12240" w:h="15840"/>
-      <w:pgMar w:top="1440" w:right="1440" w:bottom="1440" w:left="1440" w:header="720" w:footer="720" w:gutter="0"/>
+      <w:pgSz w:w="5184" w:h="6912"/>
+      <w:pgMar w:top="432" w:right="432" w:bottom="432" w:left="432" w:header="720" w:footer="720" w:gutter="0"/>
       <w:cols w:space="720"/>
       <w:docGrid w:linePitch="360"/>
     </w:sectPr>

</xml_diff>